<commit_message>
fix(status) my rentals rental detail , fix(review) image, fix(report) delivery and damage , fix(extend) apply wallet and money for request
</commit_message>
<xml_diff>
--- a/gearxpertbe/templatesContract/template_contract.docx
+++ b/gearxpertbe/templatesContract/template_contract.docx
@@ -104,15 +104,7 @@
           </w:tcPr>
           <w:p>
             <w:r>
-              <w:t>{{</w:t>
-            </w:r>
-            <w:proofErr w:type="spellStart"/>
-            <w:r>
-              <w:t>contract_number</w:t>
-            </w:r>
-            <w:proofErr w:type="spellEnd"/>
-            <w:r>
-              <w:t>}}</w:t>
+              <w:t>{{contract_number}}</w:t>
             </w:r>
           </w:p>
         </w:tc>
@@ -155,15 +147,7 @@
           </w:tcPr>
           <w:p>
             <w:r>
-              <w:t>{{</w:t>
-            </w:r>
-            <w:proofErr w:type="spellStart"/>
-            <w:r>
-              <w:t>contract_date</w:t>
-            </w:r>
-            <w:proofErr w:type="spellEnd"/>
-            <w:r>
-              <w:t>}}</w:t>
+              <w:t>{{contract_date}}</w:t>
             </w:r>
           </w:p>
         </w:tc>
@@ -231,181 +215,28 @@
     </w:p>
     <w:p>
       <w:r>
-        <w:t xml:space="preserve">- </w:t>
-      </w:r>
-      <w:proofErr w:type="spellStart"/>
-      <w:r>
-        <w:t>Họ</w:t>
-      </w:r>
-      <w:proofErr w:type="spellEnd"/>
-      <w:r>
-        <w:t xml:space="preserve"> </w:t>
-      </w:r>
-      <w:proofErr w:type="spellStart"/>
-      <w:r>
-        <w:t>tên</w:t>
-      </w:r>
-      <w:proofErr w:type="spellEnd"/>
-      <w:r>
-        <w:t>/</w:t>
-      </w:r>
-      <w:proofErr w:type="spellStart"/>
-      <w:r>
-        <w:t>Tên</w:t>
-      </w:r>
-      <w:proofErr w:type="spellEnd"/>
-      <w:r>
-        <w:t xml:space="preserve"> </w:t>
-      </w:r>
-      <w:proofErr w:type="spellStart"/>
-      <w:r>
-        <w:t>đơn</w:t>
-      </w:r>
-      <w:proofErr w:type="spellEnd"/>
-      <w:r>
-        <w:t xml:space="preserve"> </w:t>
-      </w:r>
-      <w:proofErr w:type="spellStart"/>
-      <w:r>
-        <w:t>vị</w:t>
-      </w:r>
-      <w:proofErr w:type="spellEnd"/>
-      <w:r>
-        <w:t xml:space="preserve">: </w:t>
-      </w:r>
-      <w:r>
-        <w:t>{{</w:t>
-      </w:r>
-      <w:proofErr w:type="spellStart"/>
-      <w:r>
-        <w:t>supplier_name</w:t>
-      </w:r>
-      <w:proofErr w:type="spellEnd"/>
-      <w:r>
-        <w:t>}}</w:t>
+        <w:t>- Họ tên/Tên đơn vị: {{supplier_name}}</w:t>
       </w:r>
     </w:p>
     <w:p>
       <w:r>
-        <w:t>- CCCD/</w:t>
-      </w:r>
-      <w:proofErr w:type="spellStart"/>
-      <w:r>
-        <w:t>Mã</w:t>
-      </w:r>
-      <w:proofErr w:type="spellEnd"/>
-      <w:r>
-        <w:t xml:space="preserve"> </w:t>
-      </w:r>
-      <w:proofErr w:type="spellStart"/>
-      <w:r>
-        <w:t>số</w:t>
-      </w:r>
-      <w:proofErr w:type="spellEnd"/>
-      <w:r>
-        <w:t xml:space="preserve"> </w:t>
-      </w:r>
-      <w:proofErr w:type="spellStart"/>
-      <w:r>
-        <w:t>doanh</w:t>
-      </w:r>
-      <w:proofErr w:type="spellEnd"/>
-      <w:r>
-        <w:t xml:space="preserve"> </w:t>
-      </w:r>
-      <w:proofErr w:type="spellStart"/>
-      <w:r>
-        <w:t>nghiệp</w:t>
-      </w:r>
-      <w:proofErr w:type="spellEnd"/>
-      <w:r>
-        <w:t xml:space="preserve">: </w:t>
-      </w:r>
-      <w:r>
-        <w:t>{{</w:t>
-      </w:r>
-      <w:proofErr w:type="spellStart"/>
-      <w:r>
-        <w:t>supplier_cccd</w:t>
-      </w:r>
-      <w:proofErr w:type="spellEnd"/>
-      <w:r>
-        <w:t>}}</w:t>
+        <w:t>- CCCD/Mã số doanh nghiệp: {{supplier_cccd}}</w:t>
       </w:r>
     </w:p>
     <w:p>
       <w:r>
-        <w:t xml:space="preserve">- </w:t>
-      </w:r>
-      <w:proofErr w:type="spellStart"/>
-      <w:r>
-        <w:t>Địa</w:t>
-      </w:r>
-      <w:proofErr w:type="spellEnd"/>
-      <w:r>
-        <w:t xml:space="preserve"> </w:t>
-      </w:r>
-      <w:proofErr w:type="spellStart"/>
-      <w:r>
-        <w:t>chỉ</w:t>
-      </w:r>
-      <w:proofErr w:type="spellEnd"/>
-      <w:r>
-        <w:t xml:space="preserve">: </w:t>
-      </w:r>
-      <w:r>
-        <w:t>{{</w:t>
-      </w:r>
-      <w:proofErr w:type="spellStart"/>
-      <w:r>
-        <w:t>supplier_address</w:t>
-      </w:r>
-      <w:proofErr w:type="spellEnd"/>
-      <w:r>
-        <w:t>}}</w:t>
+        <w:t>- Địa chỉ: {{supplier_address}}</w:t>
       </w:r>
     </w:p>
     <w:p>
       <w:r>
-        <w:t xml:space="preserve">- </w:t>
-      </w:r>
-      <w:proofErr w:type="spellStart"/>
-      <w:r>
-        <w:t>Số</w:t>
-      </w:r>
-      <w:proofErr w:type="spellEnd"/>
-      <w:r>
-        <w:t xml:space="preserve"> </w:t>
-      </w:r>
-      <w:proofErr w:type="spellStart"/>
-      <w:r>
-        <w:t>điện</w:t>
-      </w:r>
-      <w:proofErr w:type="spellEnd"/>
-      <w:r>
-        <w:t xml:space="preserve"> </w:t>
-      </w:r>
-      <w:proofErr w:type="spellStart"/>
-      <w:r>
-        <w:t>thoại</w:t>
-      </w:r>
-      <w:proofErr w:type="spellEnd"/>
-      <w:r>
-        <w:t>:</w:t>
+        <w:t>- Số điện thoại:</w:t>
       </w:r>
       <w:r>
         <w:t xml:space="preserve"> </w:t>
       </w:r>
       <w:r>
-        <w:t>{{</w:t>
-      </w:r>
-      <w:proofErr w:type="spellStart"/>
-      <w:r>
-        <w:t>supplier_phone</w:t>
-      </w:r>
-      <w:proofErr w:type="spellEnd"/>
-      <w:r>
-        <w:t>}}</w:t>
+        <w:t>{{supplier_phone}}</w:t>
       </w:r>
     </w:p>
     <w:p>
@@ -414,51 +245,16 @@
       </w:r>
       <w:proofErr w:type="gramStart"/>
       <w:r>
-        <w:t xml:space="preserve">Email: </w:t>
+        <w:t>Email: {{</w:t>
       </w:r>
-      <w:r>
-        <w:t>{{</w:t>
-      </w:r>
-      <w:proofErr w:type="spellStart"/>
       <w:proofErr w:type="gramEnd"/>
       <w:r>
-        <w:t>supplier_email</w:t>
-      </w:r>
-      <w:proofErr w:type="spellEnd"/>
-      <w:r>
-        <w:t>}}</w:t>
+        <w:t>supplier_email}}</w:t>
       </w:r>
     </w:p>
     <w:p>
       <w:r>
-        <w:t xml:space="preserve">- Tài </w:t>
-      </w:r>
-      <w:proofErr w:type="spellStart"/>
-      <w:r>
-        <w:t>khoản</w:t>
-      </w:r>
-      <w:proofErr w:type="spellEnd"/>
-      <w:r>
-        <w:t xml:space="preserve"> </w:t>
-      </w:r>
-      <w:proofErr w:type="spellStart"/>
-      <w:r>
-        <w:t>GearXpert</w:t>
-      </w:r>
-      <w:proofErr w:type="spellEnd"/>
-      <w:r>
-        <w:t xml:space="preserve">: </w:t>
-      </w:r>
-      <w:r>
-        <w:t>{{</w:t>
-      </w:r>
-      <w:proofErr w:type="spellStart"/>
-      <w:r>
-        <w:t>supplier_gearxpert_account</w:t>
-      </w:r>
-      <w:proofErr w:type="spellEnd"/>
-      <w:r>
-        <w:t>}}</w:t>
+        <w:t>- Tài khoản GearXpert: {{supplier_gearxpert_account}}</w:t>
       </w:r>
     </w:p>
     <w:p>
@@ -474,138 +270,22 @@
     </w:p>
     <w:p>
       <w:r>
-        <w:t xml:space="preserve">- </w:t>
-      </w:r>
-      <w:proofErr w:type="spellStart"/>
-      <w:r>
-        <w:t>Họ</w:t>
-      </w:r>
-      <w:proofErr w:type="spellEnd"/>
-      <w:r>
-        <w:t xml:space="preserve"> </w:t>
-      </w:r>
-      <w:proofErr w:type="spellStart"/>
-      <w:r>
-        <w:t>tên</w:t>
-      </w:r>
-      <w:proofErr w:type="spellEnd"/>
-      <w:r>
-        <w:t xml:space="preserve">: </w:t>
-      </w:r>
-      <w:r>
-        <w:t>{{</w:t>
-      </w:r>
-      <w:proofErr w:type="spellStart"/>
-      <w:r>
-        <w:t>customer_name</w:t>
-      </w:r>
-      <w:proofErr w:type="spellEnd"/>
-      <w:r>
-        <w:t>}}</w:t>
+        <w:t>- Họ tên: {{customer_name}}</w:t>
       </w:r>
     </w:p>
     <w:p>
       <w:r>
-        <w:t>- CCCD/</w:t>
-      </w:r>
-      <w:proofErr w:type="spellStart"/>
-      <w:r>
-        <w:t>Hộ</w:t>
-      </w:r>
-      <w:proofErr w:type="spellEnd"/>
-      <w:r>
-        <w:t xml:space="preserve"> </w:t>
-      </w:r>
-      <w:proofErr w:type="spellStart"/>
-      <w:r>
-        <w:t>chiếu</w:t>
-      </w:r>
-      <w:proofErr w:type="spellEnd"/>
-      <w:r>
-        <w:t xml:space="preserve">: </w:t>
-      </w:r>
-      <w:r>
-        <w:t>{{</w:t>
-      </w:r>
-      <w:proofErr w:type="spellStart"/>
-      <w:r>
-        <w:t>customer_cccd</w:t>
-      </w:r>
-      <w:proofErr w:type="spellEnd"/>
-      <w:r>
-        <w:t>}}</w:t>
+        <w:t>- CCCD/Hộ chiếu: {{customer_cccd}}</w:t>
       </w:r>
     </w:p>
     <w:p>
       <w:r>
-        <w:t xml:space="preserve">- </w:t>
-      </w:r>
-      <w:proofErr w:type="spellStart"/>
-      <w:r>
-        <w:t>Địa</w:t>
-      </w:r>
-      <w:proofErr w:type="spellEnd"/>
-      <w:r>
-        <w:t xml:space="preserve"> </w:t>
-      </w:r>
-      <w:proofErr w:type="spellStart"/>
-      <w:r>
-        <w:t>chỉ</w:t>
-      </w:r>
-      <w:proofErr w:type="spellEnd"/>
-      <w:r>
-        <w:t xml:space="preserve">: </w:t>
-      </w:r>
-      <w:r>
-        <w:t>{{</w:t>
-      </w:r>
-      <w:proofErr w:type="spellStart"/>
-      <w:r>
-        <w:t>customer_address</w:t>
-      </w:r>
-      <w:proofErr w:type="spellEnd"/>
-      <w:r>
-        <w:t>}}</w:t>
+        <w:t>- Địa chỉ: {{customer_address}}</w:t>
       </w:r>
     </w:p>
     <w:p>
       <w:r>
-        <w:t xml:space="preserve">- </w:t>
-      </w:r>
-      <w:proofErr w:type="spellStart"/>
-      <w:r>
-        <w:t>Số</w:t>
-      </w:r>
-      <w:proofErr w:type="spellEnd"/>
-      <w:r>
-        <w:t xml:space="preserve"> </w:t>
-      </w:r>
-      <w:proofErr w:type="spellStart"/>
-      <w:r>
-        <w:t>điện</w:t>
-      </w:r>
-      <w:proofErr w:type="spellEnd"/>
-      <w:r>
-        <w:t xml:space="preserve"> </w:t>
-      </w:r>
-      <w:proofErr w:type="spellStart"/>
-      <w:r>
-        <w:t>thoại</w:t>
-      </w:r>
-      <w:proofErr w:type="spellEnd"/>
-      <w:r>
-        <w:t xml:space="preserve">: </w:t>
-      </w:r>
-      <w:r>
-        <w:t>{{</w:t>
-      </w:r>
-      <w:proofErr w:type="spellStart"/>
-      <w:r>
-        <w:t>customer_phone</w:t>
-      </w:r>
-      <w:proofErr w:type="spellEnd"/>
-      <w:r>
-        <w:t>}}</w:t>
+        <w:t>- Số điện thoại: {{customer_phone}}</w:t>
       </w:r>
     </w:p>
     <w:p>
@@ -614,51 +294,16 @@
       </w:r>
       <w:proofErr w:type="gramStart"/>
       <w:r>
-        <w:t xml:space="preserve">Email: </w:t>
+        <w:t>Email: {{</w:t>
       </w:r>
-      <w:r>
-        <w:t>{{</w:t>
-      </w:r>
-      <w:proofErr w:type="spellStart"/>
       <w:proofErr w:type="gramEnd"/>
       <w:r>
-        <w:t>customer_email</w:t>
-      </w:r>
-      <w:proofErr w:type="spellEnd"/>
-      <w:r>
-        <w:t>}}</w:t>
+        <w:t>customer_email}}</w:t>
       </w:r>
     </w:p>
     <w:p>
       <w:r>
-        <w:t xml:space="preserve">- Tài </w:t>
-      </w:r>
-      <w:proofErr w:type="spellStart"/>
-      <w:r>
-        <w:t>khoản</w:t>
-      </w:r>
-      <w:proofErr w:type="spellEnd"/>
-      <w:r>
-        <w:t xml:space="preserve"> </w:t>
-      </w:r>
-      <w:proofErr w:type="spellStart"/>
-      <w:r>
-        <w:t>GearXpert</w:t>
-      </w:r>
-      <w:proofErr w:type="spellEnd"/>
-      <w:r>
-        <w:t xml:space="preserve">: </w:t>
-      </w:r>
-      <w:r>
-        <w:t>{{</w:t>
-      </w:r>
-      <w:proofErr w:type="spellStart"/>
-      <w:r>
-        <w:t>customer_gearxpert_account</w:t>
-      </w:r>
-      <w:proofErr w:type="spellEnd"/>
-      <w:r>
-        <w:t>}}</w:t>
+        <w:t>- Tài khoản GearXpert: {{customer_gearxpert_account}}</w:t>
       </w:r>
     </w:p>
     <w:p>
@@ -713,15 +358,7 @@
     </w:p>
     <w:p>
       <w:r>
-        <w:t>{{</w:t>
-      </w:r>
-      <w:proofErr w:type="spellStart"/>
-      <w:r>
-        <w:t>device_name</w:t>
-      </w:r>
-      <w:proofErr w:type="spellEnd"/>
-      <w:r>
-        <w:t>}}</w:t>
+        <w:t>{{device_name}}</w:t>
       </w:r>
     </w:p>
     <w:p/>
@@ -732,104 +369,18 @@
     </w:p>
     <w:p>
       <w:r>
-        <w:t>{{</w:t>
-      </w:r>
-      <w:proofErr w:type="spellStart"/>
-      <w:r>
-        <w:t>device_serial</w:t>
-      </w:r>
-      <w:proofErr w:type="spellEnd"/>
-      <w:r>
-        <w:t>}}</w:t>
+        <w:t>{{device_serial}}</w:t>
       </w:r>
     </w:p>
     <w:p/>
     <w:p>
       <w:r>
-        <w:t xml:space="preserve">- </w:t>
-      </w:r>
-      <w:proofErr w:type="spellStart"/>
-      <w:r>
-        <w:t>Tình</w:t>
-      </w:r>
-      <w:proofErr w:type="spellEnd"/>
-      <w:r>
-        <w:t xml:space="preserve"> </w:t>
-      </w:r>
-      <w:proofErr w:type="spellStart"/>
-      <w:r>
-        <w:t>trạng</w:t>
-      </w:r>
-      <w:proofErr w:type="spellEnd"/>
-      <w:r>
-        <w:t xml:space="preserve"> </w:t>
-      </w:r>
-      <w:proofErr w:type="spellStart"/>
-      <w:r>
-        <w:t>thiết</w:t>
-      </w:r>
-      <w:proofErr w:type="spellEnd"/>
-      <w:r>
-        <w:t xml:space="preserve"> </w:t>
-      </w:r>
-      <w:proofErr w:type="spellStart"/>
-      <w:r>
-        <w:t>bị</w:t>
-      </w:r>
-      <w:proofErr w:type="spellEnd"/>
-      <w:r>
-        <w:t xml:space="preserve"> </w:t>
-      </w:r>
-      <w:proofErr w:type="spellStart"/>
-      <w:r>
-        <w:t>khi</w:t>
-      </w:r>
-      <w:proofErr w:type="spellEnd"/>
-      <w:r>
-        <w:t xml:space="preserve"> </w:t>
-      </w:r>
-      <w:proofErr w:type="spellStart"/>
-      <w:r>
-        <w:t>giao</w:t>
-      </w:r>
-      <w:proofErr w:type="spellEnd"/>
-      <w:r>
-        <w:t xml:space="preserve">: </w:t>
-      </w:r>
-      <w:r>
-        <w:t>{{</w:t>
-      </w:r>
-      <w:proofErr w:type="spellStart"/>
-      <w:r>
-        <w:t>device_condition</w:t>
-      </w:r>
-      <w:proofErr w:type="spellEnd"/>
-      <w:r>
-        <w:t>}}</w:t>
+        <w:t>- Tình trạng thiết bị khi giao: {{device_condition}}</w:t>
       </w:r>
     </w:p>
     <w:p>
       <w:r>
-        <w:t xml:space="preserve">- </w:t>
-      </w:r>
-      <w:proofErr w:type="spellStart"/>
-      <w:r>
-        <w:t>Số</w:t>
-      </w:r>
-      <w:proofErr w:type="spellEnd"/>
-      <w:r>
-        <w:t xml:space="preserve"> </w:t>
-      </w:r>
-      <w:proofErr w:type="spellStart"/>
-      <w:r>
-        <w:t>lượng</w:t>
-      </w:r>
-      <w:proofErr w:type="spellEnd"/>
-      <w:r>
-        <w:t xml:space="preserve">: </w:t>
-      </w:r>
-      <w:r>
-        <w:t>{{quantity}}</w:t>
+        <w:t>- Số lượng: {{quantity}}</w:t>
       </w:r>
     </w:p>
     <w:p/>
@@ -854,15 +405,7 @@
     </w:p>
     <w:p>
       <w:r>
-        <w:t>{{</w:t>
-      </w:r>
-      <w:proofErr w:type="spellStart"/>
-      <w:r>
-        <w:t>rental_start</w:t>
-      </w:r>
-      <w:proofErr w:type="spellEnd"/>
-      <w:r>
-        <w:t>}}</w:t>
+        <w:t>{{rental_start}}</w:t>
       </w:r>
       <w:r>
         <w:tab/>
@@ -876,15 +419,7 @@
     </w:p>
     <w:p>
       <w:r>
-        <w:t>{{</w:t>
-      </w:r>
-      <w:proofErr w:type="spellStart"/>
-      <w:r>
-        <w:t>rental_end</w:t>
-      </w:r>
-      <w:proofErr w:type="spellEnd"/>
-      <w:r>
-        <w:t>}}</w:t>
+        <w:t>{{rental_end}}</w:t>
       </w:r>
     </w:p>
     <w:p/>
@@ -899,52 +434,12 @@
     <w:p>
       <w:r>
         <w:lastRenderedPageBreak/>
-        <w:t xml:space="preserve">- </w:t>
-      </w:r>
-      <w:proofErr w:type="spellStart"/>
-      <w:r>
-        <w:t>Tổng</w:t>
-      </w:r>
-      <w:proofErr w:type="spellEnd"/>
-      <w:r>
-        <w:t xml:space="preserve"> </w:t>
-      </w:r>
-      <w:proofErr w:type="spellStart"/>
-      <w:r>
-        <w:t>thời</w:t>
-      </w:r>
-      <w:proofErr w:type="spellEnd"/>
-      <w:r>
-        <w:t xml:space="preserve"> </w:t>
-      </w:r>
-      <w:proofErr w:type="spellStart"/>
-      <w:r>
-        <w:t>gian</w:t>
-      </w:r>
-      <w:proofErr w:type="spellEnd"/>
-      <w:r>
-        <w:t xml:space="preserve"> </w:t>
-      </w:r>
-      <w:proofErr w:type="spellStart"/>
-      <w:r>
-        <w:t>thuê</w:t>
-      </w:r>
-      <w:proofErr w:type="spellEnd"/>
-      <w:r>
-        <w:t xml:space="preserve">: </w:t>
+        <w:t xml:space="preserve">- Tổng thời gian thuê: </w:t>
       </w:r>
     </w:p>
     <w:p>
       <w:r>
-        <w:t>{{</w:t>
-      </w:r>
-      <w:proofErr w:type="spellStart"/>
-      <w:r>
-        <w:t>rental_duration</w:t>
-      </w:r>
-      <w:proofErr w:type="spellEnd"/>
-      <w:r>
-        <w:t>}}</w:t>
+        <w:t>{{rental_duration}}</w:t>
       </w:r>
     </w:p>
     <w:p/>
@@ -958,67 +453,16 @@
     </w:p>
     <w:p>
       <w:r>
-        <w:t xml:space="preserve">4.1. </w:t>
-      </w:r>
-      <w:proofErr w:type="spellStart"/>
-      <w:r>
-        <w:t>Giá</w:t>
-      </w:r>
-      <w:proofErr w:type="spellEnd"/>
-      <w:r>
-        <w:t xml:space="preserve"> </w:t>
-      </w:r>
-      <w:proofErr w:type="spellStart"/>
-      <w:r>
-        <w:t>thuê</w:t>
-      </w:r>
-      <w:proofErr w:type="spellEnd"/>
-      <w:r>
-        <w:t xml:space="preserve">: </w:t>
-      </w:r>
-      <w:r>
-        <w:t>{{</w:t>
-      </w:r>
-      <w:proofErr w:type="spellStart"/>
-      <w:r>
-        <w:t>rent_price</w:t>
-      </w:r>
-      <w:proofErr w:type="spellEnd"/>
-      <w:r>
-        <w:t>}}</w:t>
+        <w:t>4.1. Giá thuê: {{rent_price}}</w:t>
       </w:r>
     </w:p>
     <w:p>
       <w:r>
-        <w:t xml:space="preserve">4.2. </w:t>
+        <w:t xml:space="preserve">4.2. Tiền đặt </w:t>
       </w:r>
-      <w:proofErr w:type="spellStart"/>
-      <w:r>
-        <w:t>Tiền</w:t>
-      </w:r>
-      <w:proofErr w:type="spellEnd"/>
-      <w:r>
-        <w:t xml:space="preserve"> </w:t>
-      </w:r>
-      <w:proofErr w:type="spellStart"/>
-      <w:r>
-        <w:t>đặt</w:t>
-      </w:r>
-      <w:proofErr w:type="spellEnd"/>
-      <w:r>
-        <w:t xml:space="preserve"> </w:t>
-      </w:r>
-      <w:proofErr w:type="spellStart"/>
       <w:proofErr w:type="gramStart"/>
       <w:r>
-        <w:t>cọc</w:t>
-      </w:r>
-      <w:proofErr w:type="spellEnd"/>
-      <w:r>
-        <w:t xml:space="preserve">: </w:t>
-      </w:r>
-      <w:r>
-        <w:t>{{</w:t>
+        <w:t>cọc: {{</w:t>
       </w:r>
       <w:proofErr w:type="gramEnd"/>
       <w:r>
@@ -1027,126 +471,28 @@
     </w:p>
     <w:p>
       <w:r>
-        <w:t xml:space="preserve">4.3. </w:t>
+        <w:t>4.3. Phí giao nhận (nếu có): {{delivery_fee}}</w:t>
       </w:r>
-      <w:proofErr w:type="spellStart"/>
+    </w:p>
+    <w:p>
       <w:r>
-        <w:t>Phí</w:t>
-      </w:r>
-      <w:proofErr w:type="spellEnd"/>
-      <w:r>
-        <w:t xml:space="preserve"> </w:t>
-      </w:r>
-      <w:proofErr w:type="spellStart"/>
-      <w:r>
-        <w:t>giao</w:t>
-      </w:r>
-      <w:proofErr w:type="spellEnd"/>
-      <w:r>
-        <w:t xml:space="preserve"> </w:t>
-      </w:r>
-      <w:proofErr w:type="spellStart"/>
-      <w:r>
-        <w:t>nhận</w:t>
-      </w:r>
-      <w:proofErr w:type="spellEnd"/>
-      <w:r>
-        <w:t xml:space="preserve"> (</w:t>
-      </w:r>
-      <w:proofErr w:type="spellStart"/>
-      <w:r>
-        <w:t>nếu</w:t>
-      </w:r>
-      <w:proofErr w:type="spellEnd"/>
-      <w:r>
-        <w:t xml:space="preserve"> </w:t>
-      </w:r>
-      <w:proofErr w:type="spellStart"/>
-      <w:r>
-        <w:t>có</w:t>
-      </w:r>
-      <w:proofErr w:type="spellEnd"/>
-      <w:r>
-        <w:t xml:space="preserve">): </w:t>
+        <w:t>4.4. Tổng số tiền Bên Thuê phải thanh toán trước khi nhận thiết bị: {{</w:t>
       </w:r>
       <w:r>
-        <w:t>{{</w:t>
+        <w:t>total_payment</w:t>
       </w:r>
-      <w:proofErr w:type="spellStart"/>
-      <w:r>
-        <w:t>delivery_fee</w:t>
-      </w:r>
-      <w:proofErr w:type="spellEnd"/>
       <w:r>
         <w:t>}}</w:t>
       </w:r>
     </w:p>
     <w:p>
       <w:r>
-        <w:t>4.</w:t>
-      </w:r>
-      <w:r>
-        <w:t>4</w:t>
-      </w:r>
-      <w:r>
-        <w:t xml:space="preserve">. Tổng số tiền Bên Thuê phải thanh toán trước khi </w:t>
-      </w:r>
-      <w:proofErr w:type="spellStart"/>
-      <w:r>
-        <w:t>nhận</w:t>
-      </w:r>
-      <w:proofErr w:type="spellEnd"/>
-      <w:r>
-        <w:t xml:space="preserve"> </w:t>
-      </w:r>
-      <w:proofErr w:type="spellStart"/>
-      <w:r>
-        <w:t>thiết</w:t>
-      </w:r>
-      <w:proofErr w:type="spellEnd"/>
-      <w:r>
-        <w:t xml:space="preserve"> </w:t>
-      </w:r>
-      <w:proofErr w:type="spellStart"/>
-      <w:r>
-        <w:t>bị</w:t>
-      </w:r>
-      <w:proofErr w:type="spellEnd"/>
-      <w:r>
-        <w:t xml:space="preserve">: </w:t>
-      </w:r>
-      <w:r>
-        <w:t>{{</w:t>
-      </w:r>
-      <w:proofErr w:type="spellStart"/>
-      <w:r>
-        <w:t>total_payment</w:t>
-      </w:r>
-      <w:proofErr w:type="spellEnd"/>
-      <w:r>
-        <w:t>}}</w:t>
+        <w:t>4.5. Việc thanh toán được thực hiện qua nền tảng GearXpert hoặc phương thức khác được hệ thống cho phép.</w:t>
       </w:r>
     </w:p>
     <w:p>
       <w:r>
-        <w:t>4.</w:t>
-      </w:r>
-      <w:r>
-        <w:t>5</w:t>
-      </w:r>
-      <w:r>
-        <w:t>. Việc thanh toán được thực hiện qua nền tảng GearXpert hoặc phương thức khác được hệ thống cho phép.</w:t>
-      </w:r>
-    </w:p>
-    <w:p>
-      <w:r>
-        <w:t>4.</w:t>
-      </w:r>
-      <w:r>
-        <w:t>6</w:t>
-      </w:r>
-      <w:r>
-        <w:t>. Tiền đặt cọc nhằm bảo đảm nghĩa vụ thanh toán, hoàn trả thiết bị đúng hạn và bồi thường nếu có mất mát, hư hỏng, thiếu phụ kiện hoặc vi phạm thỏa thuận thuê.</w:t>
+        <w:t>4.6. Tiền đặt cọc nhằm bảo đảm nghĩa vụ thanh toán, hoàn trả thiết bị đúng hạn và bồi thường nếu có mất mát, hư hỏng, thiếu phụ kiện hoặc vi phạm thỏa thuận thuê.</w:t>
       </w:r>
     </w:p>
     <w:p>
@@ -1425,8 +771,6 @@
       </w:r>
       <w:r>
         <w:tab/>
-      </w:r>
-      <w:r>
         <w:t xml:space="preserve">BÊN THUÊ: </w:t>
       </w:r>
     </w:p>
@@ -1472,22 +816,12 @@
     </w:p>
     <w:p>
       <w:pPr>
-        <w:ind w:left="5760" w:firstLine="720"/>
-        <w:jc w:val="center"/>
+        <w:ind w:left="6480" w:firstLine="720"/>
       </w:pPr>
       <w:r>
-        <w:t>{{</w:t>
-      </w:r>
-      <w:proofErr w:type="spellStart"/>
-      <w:r>
-        <w:t>signatureDataUrl</w:t>
-      </w:r>
-      <w:proofErr w:type="spellEnd"/>
-      <w:r>
-        <w:t>}}</w:t>
+        <w:t>{%image%}</w:t>
       </w:r>
     </w:p>
-    <w:p/>
     <w:sectPr>
       <w:pgSz w:w="12240" w:h="15840"/>
       <w:pgMar w:top="1247" w:right="1247" w:bottom="1134" w:left="1417" w:header="720" w:footer="720" w:gutter="0"/>
@@ -2311,7 +1645,6 @@
   <w:style w:type="character" w:default="1" w:styleId="DefaultParagraphFont">
     <w:name w:val="Default Paragraph Font"/>
     <w:uiPriority w:val="1"/>
-    <w:semiHidden/>
     <w:unhideWhenUsed/>
   </w:style>
   <w:style w:type="table" w:default="1" w:styleId="TableNormal">

</xml_diff>

<commit_message>
feat(reviews)update image review , feat(adminwallet)pending plaformfee and shippingfee, topup , withdraw , transfer
</commit_message>
<xml_diff>
--- a/gearxpertbe/templatesContract/template_contract.docx
+++ b/gearxpertbe/templatesContract/template_contract.docx
@@ -458,15 +458,7 @@
     </w:p>
     <w:p>
       <w:r>
-        <w:t xml:space="preserve">4.2. Tiền đặt </w:t>
-      </w:r>
-      <w:proofErr w:type="gramStart"/>
-      <w:r>
-        <w:t>cọc: {{</w:t>
-      </w:r>
-      <w:proofErr w:type="gramEnd"/>
-      <w:r>
-        <w:t>deposit}}</w:t>
+        <w:t>4.2. Tiền đặt cọc: {{deposit}}</w:t>
       </w:r>
     </w:p>
     <w:p>
@@ -819,7 +811,7 @@
         <w:ind w:left="6480" w:firstLine="720"/>
       </w:pPr>
       <w:r>
-        <w:t>{%image%}</w:t>
+        <w:t>{{%signatureImage}}</w:t>
       </w:r>
     </w:p>
     <w:sectPr>

</xml_diff>